<commit_message>
Correct KAGA scale from official source
</commit_message>
<xml_diff>
--- a/docs/Shaher-Waheed-Roshdy-CV-source.docx
+++ b/docs/Shaher-Waheed-Roshdy-CV-source.docx
@@ -1027,7 +1027,7 @@
         <w:t xml:space="preserve">Project Area: </w:t>
       </w:r>
       <w:r>
-        <w:t>Approx. 1.5 Million m²</w:t>
+        <w:t>Approx. 2 Million m² (overall project)</w:t>
       </w:r>
       <w:r>
         <w:t xml:space="preserve">  |  </w:t>
@@ -1070,7 +1070,7 @@
         <w:rPr>
           <w:b/>
         </w:rPr>
-        <w:t>approximately 1.5 million m²</w:t>
+        <w:t>approximately 2 million m² overall</w:t>
       </w:r>
       <w:r>
         <w:rPr>

</xml_diff>

<commit_message>
Update portfolio name and add approved project visualization
</commit_message>
<xml_diff>
--- a/docs/Shaher-Waheed-Roshdy-CV-source.docx
+++ b/docs/Shaher-Waheed-Roshdy-CV-source.docx
@@ -14,7 +14,7 @@
           <w:color w:val="17365D"/>
           <w:sz w:val="36"/>
         </w:rPr>
-        <w:t>SHAHER WAHID RUSHDI ELSAYED</w:t>
+        <w:t>SHAHER WAHID RUSHDI</w:t>
       </w:r>
     </w:p>
     <w:p>
@@ -1653,7 +1653,7 @@
         <w:color w:val="888888"/>
         <w:sz w:val="14"/>
       </w:rPr>
-      <w:t>Shaher Wahid Rushdi Elsayed</w:t>
+      <w:t>Shaher Wahid Rushdi</w:t>
     </w:r>
   </w:p>
 </w:ftr>

</xml_diff>